<commit_message>
Manual tecnico con el servicio de BI y el esquema bi
</commit_message>
<xml_diff>
--- a/Fase_3/Manual_Tecnico/Manual Técnico - Tienda en Línea e Integración.docx
+++ b/Fase_3/Manual_Tecnico/Manual Técnico - Tienda en Línea e Integración.docx
@@ -57,7 +57,14 @@
           <w:rFonts w:ascii="Times New Roman" w:eastAsia="Times New Roman" w:hAnsi="Times New Roman" w:cs="Times New Roman"/>
           <w:sz w:val="24"/>
         </w:rPr>
-        <w:t>La solución se compone de tres contenedores definidos en el archivo docker-compose.yml del repositorio. El contenedor web ejecuta Odoo con todos los módulos del ERP, el CRM y el sitio web; el contenedor db ejecuta PostgreSQL con la base raiz_artesanal_db; y el contenedor mailpit actúa como servidor de correo de pruebas. Los datos se conservan en dos volúmenes de Docker, por lo que no se pierden al detener o reiniciar los contenedores.</w:t>
+        <w:t xml:space="preserve">La solución se compone de cuatro contenedores definidos en el archivo docker-compose.yml del repositorio. El contenedor web ejecuta Odoo con todos los módulos del ERP, el CRM y el sitio web; el contenedor db ejecuta PostgreSQL con las bases raiz_artesanal_db y metabase; el contenedor metabase ejecuta la herramienta de Business Intelligence; y el contenedor mailpit actúa como servidor de correo de pruebas. Los datos se conservan en dos volúmenes de Docker, por lo que no se pierden al detener o reiniciar los </w:t>
+      </w:r>
+      <w:r>
+        <w:rPr>
+          <w:rFonts w:ascii="Times New Roman" w:eastAsia="Times New Roman" w:hAnsi="Times New Roman" w:cs="Times New Roman"/>
+          <w:sz w:val="24"/>
+        </w:rPr>
+        <w:t>contenedores.</w:t>
       </w:r>
     </w:p>
     <w:p>
@@ -72,8 +79,8 @@
           <w:sz w:val="24"/>
         </w:rPr>
         <w:drawing>
-          <wp:inline distT="0" distB="0" distL="0" distR="0" wp14:anchorId="770E690D" wp14:editId="7EE116F3">
-            <wp:extent cx="5616000" cy="2222331"/>
+          <wp:inline distT="0" distB="0" distL="0" distR="0" wp14:anchorId="42E95804" wp14:editId="0CE25724">
+            <wp:extent cx="5616000" cy="2291863"/>
             <wp:effectExtent l="0" t="0" r="0" b="0"/>
             <wp:docPr id="1" name="Picture 1"/>
             <wp:cNvGraphicFramePr>
@@ -95,7 +102,7 @@
                   <pic:spPr>
                     <a:xfrm>
                       <a:off x="0" y="0"/>
-                      <a:ext cx="5616000" cy="2222331"/>
+                      <a:ext cx="5616000" cy="2291863"/>
                     </a:xfrm>
                     <a:prstGeom prst="rect">
                       <a:avLst/>
@@ -122,10 +129,10 @@
         <w:tblLook w:val="04A0" w:firstRow="1" w:lastRow="0" w:firstColumn="1" w:lastColumn="0" w:noHBand="0" w:noVBand="1"/>
       </w:tblPr>
       <w:tblGrid>
-        <w:gridCol w:w="1245"/>
-        <w:gridCol w:w="1700"/>
-        <w:gridCol w:w="2149"/>
-        <w:gridCol w:w="3734"/>
+        <w:gridCol w:w="1197"/>
+        <w:gridCol w:w="2516"/>
+        <w:gridCol w:w="1743"/>
+        <w:gridCol w:w="3372"/>
       </w:tblGrid>
       <w:tr>
         <w:tc>
@@ -145,7 +152,7 @@
         </w:tc>
         <w:tc>
           <w:tcPr>
-            <w:tcW w:w="1701" w:type="dxa"/>
+            <w:tcW w:w="1928" w:type="dxa"/>
           </w:tcPr>
           <w:p>
             <w:r>
@@ -160,7 +167,7 @@
         </w:tc>
         <w:tc>
           <w:tcPr>
-            <w:tcW w:w="2154" w:type="dxa"/>
+            <w:tcW w:w="1928" w:type="dxa"/>
           </w:tcPr>
           <w:p>
             <w:r>
@@ -206,7 +213,7 @@
         </w:tc>
         <w:tc>
           <w:tcPr>
-            <w:tcW w:w="1701" w:type="dxa"/>
+            <w:tcW w:w="1928" w:type="dxa"/>
           </w:tcPr>
           <w:p>
             <w:r>
@@ -220,7 +227,7 @@
         </w:tc>
         <w:tc>
           <w:tcPr>
-            <w:tcW w:w="2154" w:type="dxa"/>
+            <w:tcW w:w="1928" w:type="dxa"/>
           </w:tcPr>
           <w:p>
             <w:r>
@@ -264,7 +271,7 @@
         </w:tc>
         <w:tc>
           <w:tcPr>
-            <w:tcW w:w="1701" w:type="dxa"/>
+            <w:tcW w:w="1928" w:type="dxa"/>
           </w:tcPr>
           <w:p>
             <w:r>
@@ -278,7 +285,7 @@
         </w:tc>
         <w:tc>
           <w:tcPr>
-            <w:tcW w:w="2154" w:type="dxa"/>
+            <w:tcW w:w="1928" w:type="dxa"/>
           </w:tcPr>
           <w:p>
             <w:r>
@@ -316,13 +323,71 @@
                 <w:rFonts w:ascii="Times New Roman" w:eastAsia="Times New Roman" w:hAnsi="Times New Roman" w:cs="Times New Roman"/>
                 <w:sz w:val="20"/>
               </w:rPr>
+              <w:t>metabase</w:t>
+            </w:r>
+          </w:p>
+        </w:tc>
+        <w:tc>
+          <w:tcPr>
+            <w:tcW w:w="1928" w:type="dxa"/>
+          </w:tcPr>
+          <w:p>
+            <w:r>
+              <w:rPr>
+                <w:rFonts w:ascii="Times New Roman" w:eastAsia="Times New Roman" w:hAnsi="Times New Roman" w:cs="Times New Roman"/>
+                <w:sz w:val="20"/>
+              </w:rPr>
+              <w:t>metabase/metabase:v0.50.36</w:t>
+            </w:r>
+          </w:p>
+        </w:tc>
+        <w:tc>
+          <w:tcPr>
+            <w:tcW w:w="1928" w:type="dxa"/>
+          </w:tcPr>
+          <w:p>
+            <w:r>
+              <w:rPr>
+                <w:rFonts w:ascii="Times New Roman" w:eastAsia="Times New Roman" w:hAnsi="Times New Roman" w:cs="Times New Roman"/>
+                <w:sz w:val="20"/>
+              </w:rPr>
+              <w:t>3000</w:t>
+            </w:r>
+          </w:p>
+        </w:tc>
+        <w:tc>
+          <w:tcPr>
+            <w:tcW w:w="3742" w:type="dxa"/>
+          </w:tcPr>
+          <w:p>
+            <w:r>
+              <w:rPr>
+                <w:rFonts w:ascii="Times New Roman" w:eastAsia="Times New Roman" w:hAnsi="Times New Roman" w:cs="Times New Roman"/>
+                <w:sz w:val="20"/>
+              </w:rPr>
+              <w:t>Reportes de inventario, ventas y KPIs sobre el esquema bi</w:t>
+            </w:r>
+          </w:p>
+        </w:tc>
+      </w:tr>
+      <w:tr>
+        <w:tc>
+          <w:tcPr>
+            <w:tcW w:w="1247" w:type="dxa"/>
+          </w:tcPr>
+          <w:p>
+            <w:r>
+              <w:rPr>
+                <w:rFonts w:ascii="Times New Roman" w:eastAsia="Times New Roman" w:hAnsi="Times New Roman" w:cs="Times New Roman"/>
+                <w:sz w:val="20"/>
+              </w:rPr>
               <w:t>mailpit</w:t>
             </w:r>
           </w:p>
         </w:tc>
         <w:tc>
           <w:tcPr>
-            <w:tcW w:w="1701" w:type="dxa"/>
+            <w:tcW w:w="1928" w:type="dxa"/>
           </w:tcPr>
           <w:p>
             <w:r>
@@ -336,7 +401,7 @@
         </w:tc>
         <w:tc>
           <w:tcPr>
-            <w:tcW w:w="2154" w:type="dxa"/>
+            <w:tcW w:w="1928" w:type="dxa"/>
           </w:tcPr>
           <w:p>
             <w:r>
@@ -375,7 +440,8 @@
           <w:b/>
           <w:sz w:val="24"/>
         </w:rPr>
-        <w:t>Módulos Instalados</w:t>
+        <w:lastRenderedPageBreak/>
+        <w:t>Integración con Business Intelligence</w:t>
       </w:r>
     </w:p>
     <w:p>
@@ -384,26 +450,79 @@
           <w:rFonts w:ascii="Times New Roman" w:eastAsia="Times New Roman" w:hAnsi="Times New Roman" w:cs="Times New Roman"/>
           <w:sz w:val="24"/>
         </w:rPr>
-        <w:t xml:space="preserve">En </w:t>
-      </w:r>
-      <w:r>
-        <w:rPr>
-          <w:rFonts w:ascii="Times New Roman" w:eastAsia="Times New Roman" w:hAnsi="Times New Roman" w:cs="Times New Roman"/>
-          <w:b/>
-          <w:sz w:val="24"/>
-        </w:rPr>
-        <w:t>Aplicaciones</w:t>
-      </w:r>
-      <w:r>
-        <w:rPr>
-          <w:rFonts w:ascii="Times New Roman" w:eastAsia="Times New Roman" w:hAnsi="Times New Roman" w:cs="Times New Roman"/>
-          <w:sz w:val="24"/>
-        </w:rPr>
-        <w:t xml:space="preserve"> con el filtro Instalado se verifican los módulos que componen la plataforma.</w:t>
+        <w:t>Metabase no copia los datos: consulta directamente la base raiz_artesanal_db a través del esquema bi, que contiene tres vistas (bi.productos, bi.ventas y bi.kpis) definidas en Fase_3/BI/sql/vistas_bi.sql. La conexión usa el usuario bi_lectura, que solo tiene permiso de lectura sobre ese esquema y no puede consultar ni modificar las tablas de Odoo. Por eso cualquier venta, recepción o ajuste registrado en Odoo se refleja en los reportes al actualizar el tablero.</w:t>
       </w:r>
     </w:p>
     <w:p>
       <w:pPr>
+        <w:ind w:left="340"/>
+      </w:pPr>
+      <w:r>
+        <w:rPr>
+          <w:rFonts w:ascii="Times New Roman" w:eastAsia="Times New Roman" w:hAnsi="Times New Roman" w:cs="Times New Roman"/>
+          <w:sz w:val="24"/>
+        </w:rPr>
+        <w:t xml:space="preserve">• </w:t>
+      </w:r>
+      <w:r>
+        <w:rPr>
+          <w:rFonts w:ascii="Times New Roman" w:eastAsia="Times New Roman" w:hAnsi="Times New Roman" w:cs="Times New Roman"/>
+          <w:sz w:val="24"/>
+        </w:rPr>
+        <w:t>Las contraseñas de bi_lectura y del administrador de Metabase se guardan en el archivo local .env, que no se sube al repositorio.</w:t>
+      </w:r>
+    </w:p>
+    <w:p>
+      <w:pPr>
+        <w:ind w:left="340"/>
+      </w:pPr>
+      <w:r>
+        <w:rPr>
+          <w:rFonts w:ascii="Times New Roman" w:eastAsia="Times New Roman" w:hAnsi="Times New Roman" w:cs="Times New Roman"/>
+          <w:sz w:val="24"/>
+        </w:rPr>
+        <w:t>• El respaldo Base_de_Datos/metabase_fase3.dump contiene las preguntas y los tableros, sin contraseñas ni sesiones; al restaurarlo se escribe de nuevo la contraseña de bi_lectura en la conexión.</w:t>
+      </w:r>
+    </w:p>
+    <w:p>
+      <w:pPr>
+        <w:keepNext/>
+      </w:pPr>
+      <w:r>
+        <w:rPr>
+          <w:rFonts w:ascii="Times New Roman" w:eastAsia="Times New Roman" w:hAnsi="Times New Roman" w:cs="Times New Roman"/>
+          <w:b/>
+          <w:sz w:val="24"/>
+        </w:rPr>
+        <w:t>Módulos Instalados</w:t>
+      </w:r>
+    </w:p>
+    <w:p>
+      <w:r>
+        <w:rPr>
+          <w:rFonts w:ascii="Times New Roman" w:eastAsia="Times New Roman" w:hAnsi="Times New Roman" w:cs="Times New Roman"/>
+          <w:sz w:val="24"/>
+        </w:rPr>
+        <w:t xml:space="preserve">En </w:t>
+      </w:r>
+      <w:r>
+        <w:rPr>
+          <w:rFonts w:ascii="Times New Roman" w:eastAsia="Times New Roman" w:hAnsi="Times New Roman" w:cs="Times New Roman"/>
+          <w:b/>
+          <w:sz w:val="24"/>
+        </w:rPr>
+        <w:t>Aplicaciones</w:t>
+      </w:r>
+      <w:r>
+        <w:rPr>
+          <w:rFonts w:ascii="Times New Roman" w:eastAsia="Times New Roman" w:hAnsi="Times New Roman" w:cs="Times New Roman"/>
+          <w:sz w:val="24"/>
+        </w:rPr>
+        <w:t xml:space="preserve"> con el filtro Instalado se verifican los módulos que componen la plataforma.</w:t>
+      </w:r>
+    </w:p>
+    <w:p>
+      <w:pPr>
         <w:spacing w:after="100" w:line="240" w:lineRule="auto"/>
         <w:jc w:val="center"/>
       </w:pPr>
@@ -413,9 +532,8 @@
           <w:noProof/>
           <w:sz w:val="24"/>
         </w:rPr>
-        <w:lastRenderedPageBreak/>
         <w:drawing>
-          <wp:inline distT="0" distB="0" distL="0" distR="0" wp14:anchorId="1C3A529A" wp14:editId="047FAE33">
+          <wp:inline distT="0" distB="0" distL="0" distR="0" wp14:anchorId="6235BC2B" wp14:editId="4280B163">
             <wp:extent cx="5616000" cy="3354000"/>
             <wp:effectExtent l="0" t="0" r="0" b="0"/>
             <wp:docPr id="2" name="Picture 2"/>
@@ -601,6 +719,7 @@
                 <w:rFonts w:ascii="Times New Roman" w:eastAsia="Times New Roman" w:hAnsi="Times New Roman" w:cs="Times New Roman"/>
                 <w:sz w:val="20"/>
               </w:rPr>
+              <w:lastRenderedPageBreak/>
               <w:t>Ventas (sale_management)</w:t>
             </w:r>
           </w:p>
@@ -872,7 +991,6 @@
           <w:b/>
           <w:sz w:val="24"/>
         </w:rPr>
-        <w:lastRenderedPageBreak/>
         <w:t>Configuración del Sitio Web</w:t>
       </w:r>
     </w:p>
@@ -897,7 +1015,7 @@
           <w:sz w:val="24"/>
         </w:rPr>
         <w:drawing>
-          <wp:inline distT="0" distB="0" distL="0" distR="0" wp14:anchorId="314A7C3F" wp14:editId="118D4CB0">
+          <wp:inline distT="0" distB="0" distL="0" distR="0" wp14:anchorId="5E21EECA" wp14:editId="56D2B4B1">
             <wp:extent cx="5616000" cy="3354000"/>
             <wp:effectExtent l="0" t="0" r="0" b="0"/>
             <wp:docPr id="3" name="Picture 3"/>
@@ -1053,6 +1171,7 @@
                 <w:rFonts w:ascii="Times New Roman" w:eastAsia="Times New Roman" w:hAnsi="Times New Roman" w:cs="Times New Roman"/>
                 <w:sz w:val="20"/>
               </w:rPr>
+              <w:lastRenderedPageBreak/>
               <w:t>Registro de clientes</w:t>
             </w:r>
           </w:p>
@@ -1213,7 +1332,6 @@
           <w:b/>
           <w:sz w:val="24"/>
         </w:rPr>
-        <w:lastRenderedPageBreak/>
         <w:t>Integración Automática entre la Web, el ERP y el CRM</w:t>
       </w:r>
     </w:p>
@@ -1238,7 +1356,7 @@
           <w:sz w:val="24"/>
         </w:rPr>
         <w:drawing>
-          <wp:inline distT="0" distB="0" distL="0" distR="0" wp14:anchorId="74C3C092" wp14:editId="14BF8991">
+          <wp:inline distT="0" distB="0" distL="0" distR="0" wp14:anchorId="6C6AC70F" wp14:editId="576385B5">
             <wp:extent cx="5616000" cy="2446866"/>
             <wp:effectExtent l="0" t="0" r="0" b="0"/>
             <wp:docPr id="4" name="Picture 4"/>
@@ -1670,9 +1788,8 @@
           <w:noProof/>
           <w:sz w:val="24"/>
         </w:rPr>
-        <w:lastRenderedPageBreak/>
         <w:drawing>
-          <wp:inline distT="0" distB="0" distL="0" distR="0" wp14:anchorId="130D4224" wp14:editId="7EAF16F9">
+          <wp:inline distT="0" distB="0" distL="0" distR="0" wp14:anchorId="200D42F4" wp14:editId="37CE4815">
             <wp:extent cx="5616000" cy="3354000"/>
             <wp:effectExtent l="0" t="0" r="0" b="0"/>
             <wp:docPr id="5" name="Picture 5"/>
@@ -1840,7 +1957,7 @@
         </w:rPr>
         <w:lastRenderedPageBreak/>
         <w:drawing>
-          <wp:inline distT="0" distB="0" distL="0" distR="0" wp14:anchorId="1E113BA1" wp14:editId="16295BFE">
+          <wp:inline distT="0" distB="0" distL="0" distR="0" wp14:anchorId="7FB0255E" wp14:editId="23967BE4">
             <wp:extent cx="5616000" cy="3354000"/>
             <wp:effectExtent l="0" t="0" r="0" b="0"/>
             <wp:docPr id="6" name="Picture 6"/>
@@ -2088,7 +2205,7 @@
         </w:rPr>
         <w:lastRenderedPageBreak/>
         <w:drawing>
-          <wp:inline distT="0" distB="0" distL="0" distR="0" wp14:anchorId="4BBAE435" wp14:editId="5BD1A34A">
+          <wp:inline distT="0" distB="0" distL="0" distR="0" wp14:anchorId="5F1B8D4D" wp14:editId="3F08BB02">
             <wp:extent cx="4320000" cy="2580000"/>
             <wp:effectExtent l="0" t="0" r="0" b="0"/>
             <wp:docPr id="7" name="Picture 7"/>
@@ -2336,6 +2453,36 @@
           </w:p>
         </w:tc>
       </w:tr>
+      <w:tr>
+        <w:tc>
+          <w:tcPr>
+            <w:tcW w:w="3061" w:type="dxa"/>
+          </w:tcPr>
+          <w:p>
+            <w:r>
+              <w:rPr>
+                <w:rFonts w:ascii="Times New Roman" w:eastAsia="Times New Roman" w:hAnsi="Times New Roman" w:cs="Times New Roman"/>
+                <w:sz w:val="20"/>
+              </w:rPr>
+              <w:t>Metabase indica error de conexión</w:t>
+            </w:r>
+          </w:p>
+        </w:tc>
+        <w:tc>
+          <w:tcPr>
+            <w:tcW w:w="5783" w:type="dxa"/>
+          </w:tcPr>
+          <w:p>
+            <w:r>
+              <w:rPr>
+                <w:rFonts w:ascii="Times New Roman" w:eastAsia="Times New Roman" w:hAnsi="Times New Roman" w:cs="Times New Roman"/>
+                <w:sz w:val="20"/>
+              </w:rPr>
+              <w:t>Revisar en Configuración → Bases de datos la contraseña de bi_lectura y que el contenedor db esté encendido.</w:t>
+            </w:r>
+          </w:p>
+        </w:tc>
+      </w:tr>
     </w:tbl>
     <w:p/>
     <w:p>
@@ -2372,7 +2519,14 @@
           <w:rFonts w:ascii="Times New Roman" w:eastAsia="Times New Roman" w:hAnsi="Times New Roman" w:cs="Times New Roman"/>
           <w:sz w:val="24"/>
         </w:rPr>
-        <w:t>• PostgreSQL solo es accesible dentro de la red de Docker; no se publica su puerto.</w:t>
+        <w:t xml:space="preserve">• </w:t>
+      </w:r>
+      <w:r>
+        <w:rPr>
+          <w:rFonts w:ascii="Times New Roman" w:eastAsia="Times New Roman" w:hAnsi="Times New Roman" w:cs="Times New Roman"/>
+          <w:sz w:val="24"/>
+        </w:rPr>
+        <w:t>PostgreSQL solo es accesible dentro de la red de Docker; no se publica su puerto. Metabase usa un usuario de solo lectura.</w:t>
       </w:r>
     </w:p>
     <w:p>
@@ -2396,14 +2550,7 @@
           <w:rFonts w:ascii="Times New Roman" w:eastAsia="Times New Roman" w:hAnsi="Times New Roman" w:cs="Times New Roman"/>
           <w:sz w:val="24"/>
         </w:rPr>
-        <w:t xml:space="preserve">• </w:t>
-      </w:r>
-      <w:r>
-        <w:rPr>
-          <w:rFonts w:ascii="Times New Roman" w:eastAsia="Times New Roman" w:hAnsi="Times New Roman" w:cs="Times New Roman"/>
-          <w:sz w:val="24"/>
-        </w:rPr>
-        <w:t>El método de pago con tarjeta está en modo de prueba y no procesa cobros reales.</w:t>
+        <w:t>• El método de pago con tarjeta está en modo de prueba y no procesa cobros reales.</w:t>
       </w:r>
     </w:p>
     <w:sectPr>
@@ -3245,25 +3392,25 @@
       </w:pPr>
     </w:lvl>
   </w:abstractNum>
-  <w:num w:numId="1" w16cid:durableId="1374428624">
+  <w:num w:numId="1" w16cid:durableId="452675682">
     <w:abstractNumId w:val="4"/>
   </w:num>
-  <w:num w:numId="2" w16cid:durableId="95056343">
+  <w:num w:numId="2" w16cid:durableId="529490174">
     <w:abstractNumId w:val="6"/>
   </w:num>
-  <w:num w:numId="3" w16cid:durableId="1242982078">
+  <w:num w:numId="3" w16cid:durableId="2146311537">
     <w:abstractNumId w:val="2"/>
   </w:num>
-  <w:num w:numId="4" w16cid:durableId="752239538">
+  <w:num w:numId="4" w16cid:durableId="501815707">
     <w:abstractNumId w:val="5"/>
   </w:num>
-  <w:num w:numId="5" w16cid:durableId="570190501">
+  <w:num w:numId="5" w16cid:durableId="909194810">
     <w:abstractNumId w:val="1"/>
   </w:num>
-  <w:num w:numId="6" w16cid:durableId="824860520">
+  <w:num w:numId="6" w16cid:durableId="35158966">
     <w:abstractNumId w:val="3"/>
   </w:num>
-  <w:num w:numId="7" w16cid:durableId="1420904716">
+  <w:num w:numId="7" w16cid:durableId="1465082606">
     <w:abstractNumId w:val="0"/>
   </w:num>
 </w:numbering>

</xml_diff>